<commit_message>
Finalize Overworld handoff: final spec, rewritten build prompt, handoff zip
Final consistency pass: replaces revision notes with a final status
block, aligns the canon list with the asset plan, fixes a misplaced
Chapter 17 sentence, a duplicate ending line, and the Day 100 timing in
Ending C, and adds boss and traversal-Graft mentions to their chapters.
Rewrites the build prompt cleanly, removes stale frame references, and
adds a spoiler-free HANDOFF.md and a zip of the three files to hand over.

Co-Authored-By: Claude Opus 5.5 <noreply@anthropic.com>
Claude-Session: https://claude.ai/code/session_01BMg2fyHYwkbJ2ksmTrkQrm
</commit_message>
<xml_diff>
--- a/overworld/OVERWORLD_DEADLETTER_MASTER_SPEC.docx
+++ b/overworld/OVERWORLD_DEADLETTER_MASTER_SPEC.docx
@@ -127,31 +127,94 @@
           <w:bCs/>
           <w:b/>
         </w:rPr>
-        <w:t xml:space="preserve">Revision 2 notes:</w:t>
-      </w:r>
-      <w:r>
-        <w:t xml:space="preserve"> </w:t>
-      </w:r>
-      <w:r>
-        <w:t xml:space="preserve">This revision adds (a) a chapter flavor and tone ledger so the campaign does not feel like one long variation on the same moral point (Sections 7 and 12.6 to 12.9); (b) written humor, running gags, and light side activities; (c) more varied supporting-cast arcs, including a character who was simply right and a character who is simply joyful (Section 4.10 to 4.13); (d) a recurring on-screen field antagonist, Ines Kade (Section 4.11); (e) earlier seeding of the endgame mechanism and of the hospital guardian (the</w:t>
-      </w:r>
-      <w:r>
-        <w:t xml:space="preserve"> </w:t>
-      </w:r>
-      <w:r>
-        <w:t xml:space="preserve">“</w:t>
-      </w:r>
-      <w:r>
-        <w:t xml:space="preserve">Three Seals</w:t>
-      </w:r>
-      <w:r>
-        <w:t xml:space="preserve">”</w:t>
-      </w:r>
-      <w:r>
-        <w:t xml:space="preserve"> </w:t>
-      </w:r>
-      <w:r>
-        <w:t xml:space="preserve">motif and the Visiting Hours interlude); (f) continuity fixes in the endings; and (g) a sealed surprise that the clue ladder does not let players deduce in advance (Section 22). Revision 3 adds (h) Section 3.6, which guarantees that players love their Navis: an arc map, signature moments, fear scenes, per-player keepsakes, and goodbye scenes; (i) Tally as an enemy-turned-ally Navi; (j) early appearance schedules for Vale and Cordon, Voss and Concord, and the Applicant, plus a hindsight sequence before the Chapter 17 confrontation. Revision 4 adds storytelling pillars drawn from the craft of the best story-driven RPGs (Section 0.3): a day counter with a meaning, records from a predecessor team, a leitmotif that becomes the finale, a campfire system, movesets that follow arcs, act breaks rebuilt around the biggest moments, love windows before every loss, and endings that each cost something. Revision 5 removes the testimony frame and adds the Area Bible (Section 7): in-game names, and a unique look, sound, cast, landmark, and world rule for every area. Revision 6 adds the Asset Plan (Section 7), which maps every area, the hospital systems, and the Chapter 1 gang onto existing Kanto maps, buildings, and mechanics. Revision 7 is a full playtest pass: an opening sequence, a Chapter 1 Graft tutorial and first vote, a deterministic hospital crisis, traversal Grafts, the Three Seals Board and ending logic, rules for what players fight, absent-player rules, Vale’s final scene, boss pacing with three new encounters, Milo’s late appearances, Night Audit log placement, and a use for every large Kanto set piece. See PLAYTEST_REPORT.md. Players who will play the game should not read this document.</w:t>
+        <w:t xml:space="preserve">Craft touchstones:</w:t>
+      </w:r>
+      <w:r>
+        <w:t xml:space="preserve"> </w:t>
+      </w:r>
+      <w:r>
+        <w:rPr>
+          <w:iCs/>
+          <w:i/>
+        </w:rPr>
+        <w:t xml:space="preserve">Final Fantasy X</w:t>
+      </w:r>
+      <w:r>
+        <w:t xml:space="preserve"> </w:t>
+      </w:r>
+      <w:r>
+        <w:t xml:space="preserve">and</w:t>
+      </w:r>
+      <w:r>
+        <w:t xml:space="preserve"> </w:t>
+      </w:r>
+      <w:r>
+        <w:rPr>
+          <w:iCs/>
+          <w:i/>
+        </w:rPr>
+        <w:t xml:space="preserve">Clair Obscur: Expedition 33</w:t>
+      </w:r>
+      <w:r>
+        <w:t xml:space="preserve">, for storytelling technique only (Section 0.3).</w:t>
+      </w:r>
+    </w:p>
+    <w:p>
+      <w:pPr>
+        <w:pStyle w:val="BodyText"/>
+      </w:pPr>
+      <w:r>
+        <w:rPr>
+          <w:bCs/>
+          <w:b/>
+        </w:rPr>
+        <w:t xml:space="preserve">Document status: FINAL (build version).</w:t>
+      </w:r>
+      <w:r>
+        <w:t xml:space="preserve"> </w:t>
+      </w:r>
+      <w:r>
+        <w:t xml:space="preserve">This is the complete and authoritative specification. It supersedes every earlier draft, outline, and copy, including any earlier .md or .docx versions of this file. Read it together with</w:t>
+      </w:r>
+      <w:r>
+        <w:t xml:space="preserve"> </w:t>
+      </w:r>
+      <w:r>
+        <w:rPr>
+          <w:rStyle w:val="VerbatimChar"/>
+        </w:rPr>
+        <w:t xml:space="preserve">OVERWORLD_BUILD_PROMPT.md</w:t>
+      </w:r>
+      <w:r>
+        <w:t xml:space="preserve"> </w:t>
+      </w:r>
+      <w:r>
+        <w:t xml:space="preserve">(how to build) and</w:t>
+      </w:r>
+      <w:r>
+        <w:t xml:space="preserve"> </w:t>
+      </w:r>
+      <w:r>
+        <w:rPr>
+          <w:rStyle w:val="VerbatimChar"/>
+        </w:rPr>
+        <w:t xml:space="preserve">PLAYTEST_REPORT.md</w:t>
+      </w:r>
+      <w:r>
+        <w:t xml:space="preserve"> </w:t>
+      </w:r>
+      <w:r>
+        <w:t xml:space="preserve">(a simulated full playthrough and the fixes it produced).</w:t>
+      </w:r>
+      <w:r>
+        <w:t xml:space="preserve"> </w:t>
+      </w:r>
+      <w:r>
+        <w:rPr>
+          <w:bCs/>
+          <w:b/>
+        </w:rPr>
+        <w:t xml:space="preserve">Players who will play the game should not read this document; it contains every spoiler.</w:t>
       </w:r>
     </w:p>
     <w:p>
@@ -704,7 +767,7 @@
         <w:pStyle w:val="Compact"/>
       </w:pPr>
       <w:r>
-        <w:t xml:space="preserve">Use the FireRed/Kanto route progression as a structural map reference if the environment is already based on it, but create original names, dialogue, creatures, character designs, visual assets, music, and story content. Do not copy Pokémon or Mega Man characters or assets.</w:t>
+        <w:t xml:space="preserve">The project is built on the FireRed/Kanto map and uses existing Pokémon Red/FireRed tiles, sprites, and mechanics as described in the Asset Plan (Section 7). That is acceptable for a private game among friends. All story, dialogue, characters, names, and creature concepts must be original; do not copy Pokémon or Mega Man characters, story, or dialogue. If the game is ever shared publicly, every borrowed asset must be replaced first.</w:t>
       </w:r>
     </w:p>
     <w:p>
@@ -18680,7 +18743,7 @@
         <w:t xml:space="preserve"> </w:t>
       </w:r>
       <w:r>
-        <w:t xml:space="preserve">Minutes after the death, Ines Kade and Tally arrive to stabilize the scene and take Dax’s hardware into custody under a valid order (Section 4.11). The team keeps only the partial copy it already pulled.</w:t>
+        <w:t xml:space="preserve">Minutes after the death, Ines Kade and Tally arrive to stabilize the scene and take Dax’s hardware into custody under a valid order (Section 4.11). The team keeps only the copy it already pulled: a fuller one if the vote chose to secure evidence first, a partial one if it chose to report first.</w:t>
       </w:r>
     </w:p>
     <w:p>
@@ -19444,6 +19507,24 @@
           <w:bCs/>
           <w:b/>
         </w:rPr>
+        <w:t xml:space="preserve">Boss:</w:t>
+      </w:r>
+      <w:r>
+        <w:t xml:space="preserve"> </w:t>
+      </w:r>
+      <w:r>
+        <w:t xml:space="preserve">the Reputation Steward (Boss 3), fought on the Mirror Lake stage in the Cerulean Gym pool.</w:t>
+      </w:r>
+    </w:p>
+    <w:p>
+      <w:pPr>
+        <w:pStyle w:val="BodyText"/>
+      </w:pPr>
+      <w:r>
+        <w:rPr>
+          <w:bCs/>
+          <w:b/>
+        </w:rPr>
         <w:t xml:space="preserve">Clue:</w:t>
       </w:r>
       <w:r>
@@ -19631,6 +19712,40 @@
       </w:r>
       <w:r>
         <w:t xml:space="preserve">Ines Kade runs ship security under contract and is Boss 4 (Section 16). The players cannot win this fight; the objective is to get out with partial data before Halyard reinforcements arrive. Make the loss clear and survivable: the team escapes, but Kade has seen their faces and their Navis.</w:t>
+      </w:r>
+    </w:p>
+    <w:p>
+      <w:pPr>
+        <w:pStyle w:val="BodyText"/>
+      </w:pPr>
+      <w:r>
+        <w:rPr>
+          <w:bCs/>
+          <w:b/>
+        </w:rPr>
+        <w:t xml:space="preserve">Traversal Graft:</w:t>
+      </w:r>
+      <w:r>
+        <w:t xml:space="preserve"> </w:t>
+      </w:r>
+      <w:r>
+        <w:t xml:space="preserve">the players reach Oskar first and keep him stable until help arrives. The ship’s captain, grateful, gives Reaper the</w:t>
+      </w:r>
+      <w:r>
+        <w:t xml:space="preserve"> </w:t>
+      </w:r>
+      <w:r>
+        <w:rPr>
+          <w:bCs/>
+          <w:b/>
+        </w:rPr>
+        <w:t xml:space="preserve">Prune</w:t>
+      </w:r>
+      <w:r>
+        <w:t xml:space="preserve"> </w:t>
+      </w:r>
+      <w:r>
+        <w:t xml:space="preserve">Graft (Section 10.2b), which opens the cut-tree paths, including the way into Saint Orison’s core in Chapter 7.</w:t>
       </w:r>
     </w:p>
     <w:p>
@@ -21121,6 +21236,102 @@
           <w:bCs/>
           <w:b/>
         </w:rPr>
+        <w:t xml:space="preserve">Boss:</w:t>
+      </w:r>
+      <w:r>
+        <w:t xml:space="preserve"> </w:t>
+      </w:r>
+      <w:r>
+        <w:t xml:space="preserve">the Preserve’s Unsettled Guardian (Boss 8), in the Fuchsia Gym’s invisible-wall boundary ground. Players who respect its boundaries can create openings or leave without destroying it.</w:t>
+      </w:r>
+    </w:p>
+    <w:p>
+      <w:pPr>
+        <w:pStyle w:val="BodyText"/>
+      </w:pPr>
+      <w:r>
+        <w:rPr>
+          <w:bCs/>
+          <w:b/>
+        </w:rPr>
+        <w:t xml:space="preserve">Traversal Grafts:</w:t>
+      </w:r>
+      <w:r>
+        <w:t xml:space="preserve"> </w:t>
+      </w:r>
+      <w:r>
+        <w:t xml:space="preserve">the Preserve gives Hera</w:t>
+      </w:r>
+      <w:r>
+        <w:t xml:space="preserve"> </w:t>
+      </w:r>
+      <w:r>
+        <w:rPr>
+          <w:bCs/>
+          <w:b/>
+        </w:rPr>
+        <w:t xml:space="preserve">Packet Raft</w:t>
+      </w:r>
+      <w:r>
+        <w:t xml:space="preserve"> </w:t>
+      </w:r>
+      <w:r>
+        <w:t xml:space="preserve">(taught by the Datamon if the team earned trust, sold by the warden in a clumsier form if not) and Rock</w:t>
+      </w:r>
+      <w:r>
+        <w:t xml:space="preserve"> </w:t>
+      </w:r>
+      <w:r>
+        <w:rPr>
+          <w:bCs/>
+          <w:b/>
+        </w:rPr>
+        <w:t xml:space="preserve">Anchor</w:t>
+      </w:r>
+      <w:r>
+        <w:t xml:space="preserve"> </w:t>
+      </w:r>
+      <w:r>
+        <w:t xml:space="preserve">(from the warden). After the Longline race, Milo and Latch build the shared</w:t>
+      </w:r>
+      <w:r>
+        <w:t xml:space="preserve"> </w:t>
+      </w:r>
+      <w:r>
+        <w:rPr>
+          <w:bCs/>
+          <w:b/>
+        </w:rPr>
+        <w:t xml:space="preserve">Relay Hop</w:t>
+      </w:r>
+      <w:r>
+        <w:t xml:space="preserve"> </w:t>
+      </w:r>
+      <w:r>
+        <w:t xml:space="preserve">“</w:t>
+      </w:r>
+      <w:r>
+        <w:t xml:space="preserve">so you’ll stop being late</w:t>
+      </w:r>
+      <w:r>
+        <w:t xml:space="preserve">”</w:t>
+      </w:r>
+      <w:r>
+        <w:t xml:space="preserve"> </w:t>
+      </w:r>
+      <w:r>
+        <w:t xml:space="preserve">(Section 10.2b).</w:t>
+      </w:r>
+    </w:p>
+    <w:p>
+      <w:pPr>
+        <w:pStyle w:val="BodyText"/>
+      </w:pPr>
+      <w:r>
+        <w:rPr>
+          <w:bCs/>
+          <w:b/>
+        </w:rPr>
         <w:t xml:space="preserve">Consequence:</w:t>
       </w:r>
       <w:r>
@@ -21187,7 +21398,23 @@
         <w:pStyle w:val="BodyText"/>
       </w:pPr>
       <w:r>
-        <w:t xml:space="preserve">The team returns to a familiar safehouse where Bex and Pip are helping displaced users. The scene is warm and routine. Do not signal the death with ominous music or obvious foreshadowing. Pip wants to show Hera an odd data fragment; Bex jokes about the team’s planning.</w:t>
+        <w:t xml:space="preserve">At the top of the Spire the team must get past</w:t>
+      </w:r>
+      <w:r>
+        <w:t xml:space="preserve"> </w:t>
+      </w:r>
+      <w:r>
+        <w:rPr>
+          <w:bCs/>
+          <w:b/>
+        </w:rPr>
+        <w:t xml:space="preserve">the Spire Concierge</w:t>
+      </w:r>
+      <w:r>
+        <w:t xml:space="preserve"> </w:t>
+      </w:r>
+      <w:r>
+        <w:t xml:space="preserve">(Boss 10), the building’s courteous service intelligence, to reach the logs. The team returns to a familiar safehouse where Bex and Pip are helping displaced users. The scene is warm and routine. Do not signal the death with ominous music or obvious foreshadowing. Pip wants to show Hera an odd data fragment; Bex jokes about the team’s planning.</w:t>
       </w:r>
     </w:p>
     <w:p>
@@ -21395,7 +21622,23 @@
         <w:pStyle w:val="BodyText"/>
       </w:pPr>
       <w:r>
-        <w:t xml:space="preserve">A defense process is keeping a legacy node isolated. Unlike Suture, it does not simply attack everything. It allows some visitors through and appears to protect specific Datamon. The players investigate before fighting.</w:t>
+        <w:t xml:space="preserve">A defense process,</w:t>
+      </w:r>
+      <w:r>
+        <w:t xml:space="preserve"> </w:t>
+      </w:r>
+      <w:r>
+        <w:rPr>
+          <w:bCs/>
+          <w:b/>
+        </w:rPr>
+        <w:t xml:space="preserve">the Old Load’s Keeper</w:t>
+      </w:r>
+      <w:r>
+        <w:t xml:space="preserve"> </w:t>
+      </w:r>
+      <w:r>
+        <w:t xml:space="preserve">(Boss 11), is keeping a legacy node isolated. Unlike Suture, it does not simply attack everything. It allows some visitors through and appears to protect specific Datamon. The players investigate before fighting, and a team that shares power fairly can calm it rather than destroy it.</w:t>
       </w:r>
     </w:p>
     <w:p>
@@ -22470,7 +22713,7 @@
         <w:t xml:space="preserve"> </w:t>
       </w:r>
       <w:r>
-        <w:t xml:space="preserve">and shuts down its half of the system, so half the arena’s defenses go dark and the fight changes shape (Section 4.8). Vale escapes with access to the final archive. Cordon stays.</w:t>
+        <w:t xml:space="preserve">and shuts down its half of the system, so half the arena’s defenses go dark and the fight changes shape (Section 4.8). Vale escapes with access to the final archive. Cordon stays. The immediate goal is no longer to catch Vale; it is to prevent the Charter and the Whole Thread from triggering each other into catastrophe.</w:t>
       </w:r>
     </w:p>
     <w:p>
@@ -22506,7 +22749,7 @@
         <w:t xml:space="preserve"> </w:t>
       </w:r>
       <w:r>
-        <w:t xml:space="preserve">That is the hook into Chapter 18. The immediate goal is no longer to catch him; it is to prevent the Charter and the Whole Thread from triggering each other into catastrophe.</w:t>
+        <w:t xml:space="preserve">That is the hook into Chapter 18.</w:t>
       </w:r>
     </w:p>
     <w:p>
@@ -27454,7 +27697,7 @@
         <w:pStyle w:val="BodyText"/>
       </w:pPr>
       <w:r>
-        <w:t xml:space="preserve">The ending is safer in the immediate term, but it accepts the central injustice that unverified beings can be erased without individual review. Postscript is among the deleted (Section 22); the last thing Rock receives from it is a delivery receipt. Ines Kade is reassigned and appears in the final montage in a new uniform.</w:t>
+        <w:t xml:space="preserve">The ending is safer in the immediate term, but it accepts the central injustice that unverified beings can be erased without individual review. Postscript is among the deleted (Section 22); the last thing Rock receives from it is a delivery receipt.</w:t>
       </w:r>
     </w:p>
     <w:p>
@@ -27642,7 +27885,7 @@
         <w:t xml:space="preserve"> </w:t>
       </w:r>
       <w:r>
-        <w:t xml:space="preserve">The counter rolls to Day 100 during the hearing. Nothing resets. Then each Navi turns to its own human, in a private scene, and asks the question the whole game has been building to. Not</w:t>
+        <w:t xml:space="preserve">The counter rolls to Day 100 at the end of the finale (Chapter 20), and the reset scheduled for that day does not happen. Within hours, the first public Witness Protocol hearing is convened as an emergency session. Then each Navi turns to its own human, in a private scene, and asks the question the whole game has been building to. Not</w:t>
       </w:r>
       <w:r>
         <w:t xml:space="preserve"> </w:t>

</xml_diff>